<commit_message>
Deploying to gh-pages from @ Morrison-Lab/wai@6c6828d37370b97919bd243b082dfd2774e1beeb 🚀
</commit_message>
<xml_diff>
--- a/chapters/ai-for-math.docx
+++ b/chapters/ai-for-math.docx
@@ -15,7 +15,7 @@
         <w:pStyle w:val="Date"/>
       </w:pPr>
       <w:r>
-        <w:t xml:space="preserve">Last modified: 2026-09-01 19:33:09 (PDT)</w:t>
+        <w:t xml:space="preserve">Last modified: 2026-09-01 20:05:55 (PDT)</w:t>
       </w:r>
     </w:p>
     <w:p>
@@ -29,7 +29,7 @@
         <w:t xml:space="preserve"> </w:t>
       </w:r>
       <w:r>
-        <w:t xml:space="preserve">reasoning, which is the part of an AI assistant’s work a statistics lab</w:t>
+        <w:t xml:space="preserve">and statistical reasoning, which is the part of an AI assistant’s work a statistics lab</w:t>
       </w:r>
       <w:r>
         <w:t xml:space="preserve"> </w:t>
@@ -153,51 +153,715 @@
               <w:spacing w:before="16" w:after="16"/>
             </w:pPr>
             <w:r>
-              <w:t xml:space="preserve">The resources reviewed here change weekly.</w:t>
+              <w:t xml:space="preserve">The resources and benchmark suites reviewed here evolve quickly.</w:t>
             </w:r>
             <w:r>
               <w:t xml:space="preserve"> </w:t>
             </w:r>
             <w:r>
-              <w:t xml:space="preserve">Entry counts, model names, and benchmark results quoted below</w:t>
+              <w:t xml:space="preserve">Entry counts, cataloged models, and benchmark references quoted below</w:t>
             </w:r>
             <w:r>
               <w:t xml:space="preserve"> </w:t>
             </w:r>
             <w:r>
-              <w:t xml:space="preserve">were true when the section was written (the date is stated in each section)</w:t>
+              <w:t xml:space="preserve">reflect the ecosystem as surveyed on 2026-09-01 and will drift.</w:t>
             </w:r>
             <w:r>
               <w:t xml:space="preserve"> </w:t>
             </w:r>
             <w:r>
-              <w:t xml:space="preserve">and will drift.</w:t>
-            </w:r>
-            <w:r>
-              <w:t xml:space="preserve"> </w:t>
-            </w:r>
-            <w:r>
-              <w:t xml:space="preserve">Re-check the source before acting on any of them.</w:t>
+              <w:t xml:space="preserve">Re-check primary sources before relying on specific entries.</w:t>
             </w:r>
           </w:p>
           <w:p/>
         </w:tc>
       </w:tr>
     </w:tbl>
-    <w:bookmarkStart w:id="17" w:name="sec-math-awesome-list"/>
+    <w:bookmarkStart w:id="14" w:name="sec-ai-math-reasoning"/>
     <w:p>
       <w:pPr>
         <w:pStyle w:val="Heading1"/>
       </w:pPr>
       <w:r>
-        <w:t xml:space="preserve">1. A Reading List: Awesome-Math-LLM</w:t>
+        <w:t xml:space="preserve">1. Search-Time Compute and Verified Reasoning</w:t>
       </w:r>
     </w:p>
     <w:p>
       <w:pPr>
         <w:pStyle w:val="FirstParagraph"/>
       </w:pPr>
+      <w:r>
+        <w:t xml:space="preserve">The landscape of AI for mathematics and statistics has evolved rapidly from</w:t>
+      </w:r>
+      <w:r>
+        <w:t xml:space="preserve"> </w:t>
+      </w:r>
+      <w:r>
+        <w:t xml:space="preserve">token prediction to test-time search and verified reasoning.</w:t>
+      </w:r>
+      <w:r>
+        <w:t xml:space="preserve"> </w:t>
+      </w:r>
+      <w:r>
+        <w:t xml:space="preserve">Modern reasoning models combine deep chain-of-thought generation with</w:t>
+      </w:r>
+      <w:r>
+        <w:t xml:space="preserve"> </w:t>
+      </w:r>
+      <w:r>
+        <w:t xml:space="preserve">symbolic computing tools, formal theorem provers, and search algorithms</w:t>
+      </w:r>
+      <w:r>
+        <w:t xml:space="preserve"> </w:t>
+      </w:r>
+      <w:r>
+        <w:t xml:space="preserve">to solve complex analytical and statistical problems.</w:t>
+      </w:r>
+    </w:p>
+    <w:p>
+      <w:pPr>
+        <w:pStyle w:val="BodyText"/>
+      </w:pPr>
+      <w:r>
+        <w:t xml:space="preserve">Traditional large language models often struggle with multi-step arithmetic,</w:t>
+      </w:r>
+      <w:r>
+        <w:t xml:space="preserve"> </w:t>
+      </w:r>
+      <w:r>
+        <w:t xml:space="preserve">algebraic manipulation, and rigorous proof construction because standard</w:t>
+      </w:r>
+      <w:r>
+        <w:t xml:space="preserve"> </w:t>
+      </w:r>
+      <w:r>
+        <w:t xml:space="preserve">autoregressive decoding lacks backtracking and error correction.</w:t>
+      </w:r>
+    </w:p>
+    <w:p>
+      <w:pPr>
+        <w:pStyle w:val="BodyText"/>
+      </w:pPr>
+      <w:r>
+        <w:t xml:space="preserve">Recent research demonstrates that test-time compute scaling dramatically enhances</w:t>
+      </w:r>
+      <w:r>
+        <w:t xml:space="preserve"> </w:t>
+      </w:r>
+      <w:r>
+        <w:t xml:space="preserve">mathematical problem-solving:</w:t>
+      </w:r>
+    </w:p>
+    <w:p>
+      <w:pPr>
+        <w:pStyle w:val="Compact"/>
+        <w:numPr>
+          <w:ilvl w:val="0"/>
+          <w:numId w:val="1001"/>
+        </w:numPr>
+      </w:pPr>
+      <w:r>
+        <w:rPr>
+          <w:b/>
+          <w:bCs/>
+        </w:rPr>
+        <w:t xml:space="preserve">MCTS and Step-Level Verification</w:t>
+      </w:r>
+      <w:r>
+        <w:t xml:space="preserve">:</w:t>
+      </w:r>
+      <w:r>
+        <w:t xml:space="preserve"> </w:t>
+      </w:r>
+      <w:r>
+        <w:t xml:space="preserve">Architectures like</w:t>
+      </w:r>
+      <w:r>
+        <w:t xml:space="preserve"> </w:t>
+      </w:r>
       <w:hyperlink r:id="rId12">
+        <w:r>
+          <w:rPr>
+            <w:rStyle w:val="Hyperlink"/>
+            <w:b/>
+            <w:bCs/>
+          </w:rPr>
+          <w:t xml:space="preserve">rStar-Math</w:t>
+        </w:r>
+      </w:hyperlink>
+      <w:r>
+        <w:t xml:space="preserve"> </w:t>
+      </w:r>
+      <w:r>
+        <w:t xml:space="preserve">(Microsoft Research, 2025) apply</w:t>
+      </w:r>
+      <w:r>
+        <w:t xml:space="preserve"> </w:t>
+      </w:r>
+      <w:r>
+        <w:t xml:space="preserve">Monte Carlo Tree Search (MCTS) with step-level Process Reward Models (PRMs).</w:t>
+      </w:r>
+      <w:r>
+        <w:t xml:space="preserve"> </w:t>
+      </w:r>
+      <w:r>
+        <w:t xml:space="preserve">By generating multiple candidate trajectories, evaluating each step with</w:t>
+      </w:r>
+      <w:r>
+        <w:t xml:space="preserve"> </w:t>
+      </w:r>
+      <w:r>
+        <w:t xml:space="preserve">a reward model, and exploring alternative branches upon encountering dead ends,</w:t>
+      </w:r>
+      <w:r>
+        <w:t xml:space="preserve"> </w:t>
+      </w:r>
+      <w:r>
+        <w:t xml:space="preserve">small language models (SLMs such as</w:t>
+      </w:r>
+      <w:r>
+        <w:t xml:space="preserve"> </w:t>
+      </w:r>
+      <w:r>
+        <w:rPr>
+          <w:rStyle w:val="VerbatimChar"/>
+        </w:rPr>
+        <w:t xml:space="preserve">Qwen2.5-Math-7B</w:t>
+      </w:r>
+      <w:r>
+        <w:t xml:space="preserve">) can achieve accuracy on</w:t>
+      </w:r>
+      <w:r>
+        <w:t xml:space="preserve"> </w:t>
+      </w:r>
+      <w:r>
+        <w:t xml:space="preserve">competition benchmarks that previously required models with hundreds of billions of parameters.</w:t>
+      </w:r>
+    </w:p>
+    <w:p>
+      <w:pPr>
+        <w:pStyle w:val="Compact"/>
+        <w:numPr>
+          <w:ilvl w:val="0"/>
+          <w:numId w:val="1001"/>
+        </w:numPr>
+      </w:pPr>
+      <w:r>
+        <w:rPr>
+          <w:b/>
+          <w:bCs/>
+        </w:rPr>
+        <w:t xml:space="preserve">Code-Augmented Symbolic Execution</w:t>
+      </w:r>
+      <w:r>
+        <w:t xml:space="preserve">:</w:t>
+      </w:r>
+      <w:r>
+        <w:t xml:space="preserve"> </w:t>
+      </w:r>
+      <w:r>
+        <w:t xml:space="preserve">Rather than performing mental arithmetic or symbolic integration directly</w:t>
+      </w:r>
+      <w:r>
+        <w:t xml:space="preserve"> </w:t>
+      </w:r>
+      <w:r>
+        <w:t xml:space="preserve">in natural language tokens, effective mathematical agents generate executable</w:t>
+      </w:r>
+      <w:r>
+        <w:t xml:space="preserve"> </w:t>
+      </w:r>
+      <w:r>
+        <w:t xml:space="preserve">Python (using libraries such as</w:t>
+      </w:r>
+      <w:r>
+        <w:t xml:space="preserve"> </w:t>
+      </w:r>
+      <w:hyperlink r:id="rId13">
+        <w:r>
+          <w:rPr>
+            <w:rStyle w:val="Hyperlink"/>
+          </w:rPr>
+          <w:t xml:space="preserve">SymPy</w:t>
+        </w:r>
+      </w:hyperlink>
+      <w:r>
+        <w:t xml:space="preserve">,</w:t>
+      </w:r>
+      <w:r>
+        <w:t xml:space="preserve"> </w:t>
+      </w:r>
+      <w:r>
+        <w:rPr>
+          <w:rStyle w:val="VerbatimChar"/>
+        </w:rPr>
+        <w:t xml:space="preserve">NumPy</w:t>
+      </w:r>
+      <w:r>
+        <w:t xml:space="preserve">, or</w:t>
+      </w:r>
+      <w:r>
+        <w:t xml:space="preserve"> </w:t>
+      </w:r>
+      <w:r>
+        <w:rPr>
+          <w:rStyle w:val="VerbatimChar"/>
+        </w:rPr>
+        <w:t xml:space="preserve">SciPy</w:t>
+      </w:r>
+      <w:r>
+        <w:t xml:space="preserve">) or R code.</w:t>
+      </w:r>
+      <w:r>
+        <w:t xml:space="preserve"> </w:t>
+      </w:r>
+      <w:r>
+        <w:t xml:space="preserve">The execution output acts as an exact ground-truth oracle, eliminating</w:t>
+      </w:r>
+      <w:r>
+        <w:t xml:space="preserve"> </w:t>
+      </w:r>
+      <w:r>
+        <w:t xml:space="preserve">arithmetic calculation mistakes and confirming intermediate algebraic steps.</w:t>
+      </w:r>
+    </w:p>
+    <w:bookmarkEnd w:id="14"/>
+    <w:bookmarkStart w:id="16" w:name="sec-ai-math-benchmarks"/>
+    <w:p>
+      <w:pPr>
+        <w:pStyle w:val="Heading1"/>
+      </w:pPr>
+      <w:r>
+        <w:t xml:space="preserve">2. Benchmark Taxonomy and Model Evaluation</w:t>
+      </w:r>
+    </w:p>
+    <w:p>
+      <w:pPr>
+        <w:pStyle w:val="FirstParagraph"/>
+      </w:pPr>
+      <w:r>
+        <w:t xml:space="preserve">The mathematical AI ecosystem utilizes a tiered benchmark hierarchy to assess</w:t>
+      </w:r>
+      <w:r>
+        <w:t xml:space="preserve"> </w:t>
+      </w:r>
+      <w:r>
+        <w:t xml:space="preserve">reasoning capability across varying levels of abstraction:</w:t>
+      </w:r>
+    </w:p>
+    <w:tbl>
+      <w:tblPr>
+        <w:tblStyle w:val="Table"/>
+        <w:tblW w:type="pct" w:w="5000"/>
+        <w:tblLayout w:type="fixed"/>
+        <w:tblLook w:firstRow="1" w:lastRow="0" w:firstColumn="0" w:lastColumn="0" w:noHBand="0" w:noVBand="0" w:val="0020"/>
+      </w:tblPr>
+      <w:tblGrid>
+        <w:gridCol w:w="2640"/>
+        <w:gridCol w:w="2640"/>
+        <w:gridCol w:w="2640"/>
+      </w:tblGrid>
+      <w:tr>
+        <w:trPr>
+          <w:tblHeader w:val="on"/>
+        </w:trPr>
+        <w:tc>
+          <w:tcPr/>
+          <w:p>
+            <w:pPr>
+              <w:pStyle w:val="Compact"/>
+            </w:pPr>
+            <w:r>
+              <w:t xml:space="preserve">Benchmark Tier</w:t>
+            </w:r>
+          </w:p>
+        </w:tc>
+        <w:tc>
+          <w:tcPr/>
+          <w:p>
+            <w:pPr>
+              <w:pStyle w:val="Compact"/>
+            </w:pPr>
+            <w:r>
+              <w:t xml:space="preserve">Target Competencies</w:t>
+            </w:r>
+          </w:p>
+        </w:tc>
+        <w:tc>
+          <w:tcPr/>
+          <w:p>
+            <w:pPr>
+              <w:pStyle w:val="Compact"/>
+            </w:pPr>
+            <w:r>
+              <w:t xml:space="preserve">Key Benchmarks</w:t>
+            </w:r>
+          </w:p>
+        </w:tc>
+      </w:tr>
+      <w:tr>
+        <w:tc>
+          <w:tcPr/>
+          <w:p>
+            <w:pPr>
+              <w:pStyle w:val="Compact"/>
+            </w:pPr>
+            <w:r>
+              <w:rPr>
+                <w:b/>
+                <w:bCs/>
+              </w:rPr>
+              <w:t xml:space="preserve">Grade School &amp; High School</w:t>
+            </w:r>
+          </w:p>
+        </w:tc>
+        <w:tc>
+          <w:tcPr/>
+          <w:p>
+            <w:pPr>
+              <w:pStyle w:val="Compact"/>
+            </w:pPr>
+            <w:r>
+              <w:t xml:space="preserve">Arithmetic, multi-step word problems, basic algebra</w:t>
+            </w:r>
+          </w:p>
+        </w:tc>
+        <w:tc>
+          <w:tcPr/>
+          <w:p>
+            <w:pPr>
+              <w:pStyle w:val="Compact"/>
+            </w:pPr>
+            <w:r>
+              <w:rPr>
+                <w:rStyle w:val="VerbatimChar"/>
+              </w:rPr>
+              <w:t xml:space="preserve">GSM8K</w:t>
+            </w:r>
+            <w:r>
+              <w:t xml:space="preserve">,</w:t>
+            </w:r>
+            <w:r>
+              <w:t xml:space="preserve"> </w:t>
+            </w:r>
+            <w:r>
+              <w:rPr>
+                <w:rStyle w:val="VerbatimChar"/>
+              </w:rPr>
+              <w:t xml:space="preserve">SVAMP</w:t>
+            </w:r>
+            <w:r>
+              <w:t xml:space="preserve">,</w:t>
+            </w:r>
+            <w:r>
+              <w:t xml:space="preserve"> </w:t>
+            </w:r>
+            <w:r>
+              <w:rPr>
+                <w:rStyle w:val="VerbatimChar"/>
+              </w:rPr>
+              <w:t xml:space="preserve">MATH-500</w:t>
+            </w:r>
+          </w:p>
+        </w:tc>
+      </w:tr>
+      <w:tr>
+        <w:tc>
+          <w:tcPr/>
+          <w:p>
+            <w:pPr>
+              <w:pStyle w:val="Compact"/>
+            </w:pPr>
+            <w:r>
+              <w:rPr>
+                <w:b/>
+                <w:bCs/>
+              </w:rPr>
+              <w:t xml:space="preserve">Competition &amp; University</w:t>
+            </w:r>
+          </w:p>
+        </w:tc>
+        <w:tc>
+          <w:tcPr/>
+          <w:p>
+            <w:pPr>
+              <w:pStyle w:val="Compact"/>
+            </w:pPr>
+            <w:r>
+              <w:t xml:space="preserve">Non-routine problem solving, combinatorics, number theory</w:t>
+            </w:r>
+          </w:p>
+        </w:tc>
+        <w:tc>
+          <w:tcPr/>
+          <w:p>
+            <w:pPr>
+              <w:pStyle w:val="Compact"/>
+            </w:pPr>
+            <w:r>
+              <w:rPr>
+                <w:rStyle w:val="VerbatimChar"/>
+              </w:rPr>
+              <w:t xml:space="preserve">AMC 10/12</w:t>
+            </w:r>
+            <w:r>
+              <w:t xml:space="preserve">,</w:t>
+            </w:r>
+            <w:r>
+              <w:t xml:space="preserve"> </w:t>
+            </w:r>
+            <w:r>
+              <w:rPr>
+                <w:rStyle w:val="VerbatimChar"/>
+              </w:rPr>
+              <w:t xml:space="preserve">AIME</w:t>
+            </w:r>
+            <w:r>
+              <w:t xml:space="preserve">,</w:t>
+            </w:r>
+            <w:r>
+              <w:t xml:space="preserve"> </w:t>
+            </w:r>
+            <w:r>
+              <w:rPr>
+                <w:rStyle w:val="VerbatimChar"/>
+              </w:rPr>
+              <w:t xml:space="preserve">OlympiadBench</w:t>
+            </w:r>
+            <w:r>
+              <w:t xml:space="preserve">,</w:t>
+            </w:r>
+            <w:r>
+              <w:t xml:space="preserve"> </w:t>
+            </w:r>
+            <w:r>
+              <w:rPr>
+                <w:rStyle w:val="VerbatimChar"/>
+              </w:rPr>
+              <w:t xml:space="preserve">Putnam</w:t>
+            </w:r>
+            <w:r>
+              <w:t xml:space="preserve">,</w:t>
+            </w:r>
+            <w:r>
+              <w:t xml:space="preserve"> </w:t>
+            </w:r>
+            <w:r>
+              <w:rPr>
+                <w:rStyle w:val="VerbatimChar"/>
+              </w:rPr>
+              <w:t xml:space="preserve">MMLU-Pro</w:t>
+            </w:r>
+            <w:r>
+              <w:t xml:space="preserve">,</w:t>
+            </w:r>
+            <w:r>
+              <w:t xml:space="preserve"> </w:t>
+            </w:r>
+            <w:r>
+              <w:rPr>
+                <w:rStyle w:val="VerbatimChar"/>
+              </w:rPr>
+              <w:t xml:space="preserve">GPQA</w:t>
+            </w:r>
+          </w:p>
+        </w:tc>
+      </w:tr>
+      <w:tr>
+        <w:tc>
+          <w:tcPr/>
+          <w:p>
+            <w:pPr>
+              <w:pStyle w:val="Compact"/>
+            </w:pPr>
+            <w:r>
+              <w:rPr>
+                <w:b/>
+                <w:bCs/>
+              </w:rPr>
+              <w:t xml:space="preserve">Formal Theorem Proving</w:t>
+            </w:r>
+          </w:p>
+        </w:tc>
+        <w:tc>
+          <w:tcPr/>
+          <w:p>
+            <w:pPr>
+              <w:pStyle w:val="Compact"/>
+            </w:pPr>
+            <w:r>
+              <w:t xml:space="preserve">Syntactically verifiable proofs in formal proof assistants</w:t>
+            </w:r>
+          </w:p>
+        </w:tc>
+        <w:tc>
+          <w:tcPr/>
+          <w:p>
+            <w:pPr>
+              <w:pStyle w:val="Compact"/>
+            </w:pPr>
+            <w:hyperlink r:id="rId15">
+              <w:r>
+                <w:rPr>
+                  <w:rStyle w:val="Hyperlink"/>
+                </w:rPr>
+                <w:t xml:space="preserve">Lean 4</w:t>
+              </w:r>
+            </w:hyperlink>
+            <w:r>
+              <w:t xml:space="preserve">, Isabelle, Coq,</w:t>
+            </w:r>
+            <w:r>
+              <w:t xml:space="preserve"> </w:t>
+            </w:r>
+            <w:r>
+              <w:rPr>
+                <w:rStyle w:val="VerbatimChar"/>
+              </w:rPr>
+              <w:t xml:space="preserve">MiniF2F</w:t>
+            </w:r>
+            <w:r>
+              <w:t xml:space="preserve">,</w:t>
+            </w:r>
+            <w:r>
+              <w:t xml:space="preserve"> </w:t>
+            </w:r>
+            <w:r>
+              <w:rPr>
+                <w:rStyle w:val="VerbatimChar"/>
+              </w:rPr>
+              <w:t xml:space="preserve">ProofNet</w:t>
+            </w:r>
+          </w:p>
+        </w:tc>
+      </w:tr>
+    </w:tbl>
+    <w:p>
+      <w:pPr>
+        <w:pStyle w:val="BodyText"/>
+      </w:pPr>
+      <w:r>
+        <w:t xml:space="preserve">Frontier reasoning models achieve high scores on competition-level examinations</w:t>
+      </w:r>
+      <w:r>
+        <w:t xml:space="preserve"> </w:t>
+      </w:r>
+      <w:r>
+        <w:t xml:space="preserve">by spending adaptive reasoning compute before generating final answers:</w:t>
+      </w:r>
+    </w:p>
+    <w:p>
+      <w:pPr>
+        <w:pStyle w:val="Compact"/>
+        <w:numPr>
+          <w:ilvl w:val="0"/>
+          <w:numId w:val="1002"/>
+        </w:numPr>
+      </w:pPr>
+      <w:r>
+        <w:rPr>
+          <w:b/>
+          <w:bCs/>
+        </w:rPr>
+        <w:t xml:space="preserve">Proprietary Frontier</w:t>
+      </w:r>
+      <w:r>
+        <w:t xml:space="preserve">: OpenAI o1/o3-mini, Claude 3.7 Sonnet, and Claude Sonnet 4.5 (with extended thinking).</w:t>
+      </w:r>
+    </w:p>
+    <w:p>
+      <w:pPr>
+        <w:pStyle w:val="Compact"/>
+        <w:numPr>
+          <w:ilvl w:val="0"/>
+          <w:numId w:val="1002"/>
+        </w:numPr>
+      </w:pPr>
+      <w:r>
+        <w:rPr>
+          <w:b/>
+          <w:bCs/>
+        </w:rPr>
+        <w:t xml:space="preserve">Open-Weight Reasoning</w:t>
+      </w:r>
+      <w:r>
+        <w:t xml:space="preserve">: DeepSeek-R1 and</w:t>
+      </w:r>
+      <w:r>
+        <w:t xml:space="preserve"> </w:t>
+      </w:r>
+      <w:r>
+        <w:rPr>
+          <w:rStyle w:val="VerbatimChar"/>
+        </w:rPr>
+        <w:t xml:space="preserve">QwQ-32B</w:t>
+      </w:r>
+      <w:r>
+        <w:t xml:space="preserve">.</w:t>
+      </w:r>
+    </w:p>
+    <w:p>
+      <w:pPr>
+        <w:pStyle w:val="Compact"/>
+        <w:numPr>
+          <w:ilvl w:val="0"/>
+          <w:numId w:val="1002"/>
+        </w:numPr>
+      </w:pPr>
+      <w:r>
+        <w:rPr>
+          <w:b/>
+          <w:bCs/>
+        </w:rPr>
+        <w:t xml:space="preserve">Specialized Mathematical Weights</w:t>
+      </w:r>
+      <w:r>
+        <w:t xml:space="preserve">:</w:t>
+      </w:r>
+      <w:r>
+        <w:t xml:space="preserve"> </w:t>
+      </w:r>
+      <w:r>
+        <w:rPr>
+          <w:rStyle w:val="VerbatimChar"/>
+        </w:rPr>
+        <w:t xml:space="preserve">Qwen2.5-Math-72B</w:t>
+      </w:r>
+      <w:r>
+        <w:t xml:space="preserve"> </w:t>
+      </w:r>
+      <w:r>
+        <w:t xml:space="preserve">and</w:t>
+      </w:r>
+      <w:r>
+        <w:t xml:space="preserve"> </w:t>
+      </w:r>
+      <w:r>
+        <w:rPr>
+          <w:rStyle w:val="VerbatimChar"/>
+        </w:rPr>
+        <w:t xml:space="preserve">NuminaMath</w:t>
+      </w:r>
+      <w:r>
+        <w:t xml:space="preserve">.</w:t>
+      </w:r>
+    </w:p>
+    <w:bookmarkEnd w:id="16"/>
+    <w:bookmarkStart w:id="22" w:name="sec-math-awesome-list"/>
+    <w:p>
+      <w:pPr>
+        <w:pStyle w:val="Heading1"/>
+      </w:pPr>
+      <w:r>
+        <w:t xml:space="preserve">3. Curated Reading List: Awesome-Math-LLM</w:t>
+      </w:r>
+    </w:p>
+    <w:p>
+      <w:pPr>
+        <w:pStyle w:val="FirstParagraph"/>
+      </w:pPr>
+      <w:hyperlink r:id="rId17">
         <w:r>
           <w:rPr>
             <w:rStyle w:val="VerbatimChar"/>
@@ -209,7 +873,7 @@
         <w:t xml:space="preserve"> </w:t>
       </w:r>
       <w:r>
-        <w:t xml:space="preserve">is an MIT-licensed, community-curated list of resources on large language</w:t>
+        <w:t xml:space="preserve">is an MIT-licensed, community-curated directory of resources on large language</w:t>
       </w:r>
       <w:r>
         <w:t xml:space="preserve"> </w:t>
@@ -221,28 +885,22 @@
         <w:t xml:space="preserve"> </w:t>
       </w:r>
       <w:r>
-        <w:t xml:space="preserve">The notes below reflect its README as read on 2026-09-01,</w:t>
-      </w:r>
-      <w:r>
-        <w:t xml:space="preserve"> </w:t>
-      </w:r>
-      <w:r>
-        <w:t xml:space="preserve">when it carried about 310 entries,</w:t>
-      </w:r>
-      <w:r>
-        <w:t xml:space="preserve"> </w:t>
-      </w:r>
-      <w:r>
-        <w:t xml:space="preserve">most of them papers on arXiv with a code or model link where one exists.</w:t>
-      </w:r>
-    </w:p>
-    <w:bookmarkStart w:id="14" w:name="what-it-covers"/>
+        <w:t xml:space="preserve">The notes below reflect its catalog as surveyed on 2026-09-01,</w:t>
+      </w:r>
+      <w:r>
+        <w:t xml:space="preserve"> </w:t>
+      </w:r>
+      <w:r>
+        <w:t xml:space="preserve">when it carried over 310 papers and code repositories.</w:t>
+      </w:r>
+    </w:p>
+    <w:bookmarkStart w:id="19" w:name="what-it-covers"/>
     <w:p>
       <w:pPr>
         <w:pStyle w:val="Heading2"/>
       </w:pPr>
       <w:r>
-        <w:t xml:space="preserve">1.1 What it covers</w:t>
+        <w:t xml:space="preserve">3.1 What it covers</w:t>
       </w:r>
     </w:p>
     <w:p>
@@ -250,7 +908,7 @@
         <w:pStyle w:val="FirstParagraph"/>
       </w:pPr>
       <w:r>
-        <w:t xml:space="preserve">The list is organized into seven content sections:</w:t>
+        <w:t xml:space="preserve">The repository is organized into seven core areas:</w:t>
       </w:r>
     </w:p>
     <w:p>
@@ -258,7 +916,7 @@
         <w:pStyle w:val="Compact"/>
         <w:numPr>
           <w:ilvl w:val="0"/>
-          <w:numId w:val="1001"/>
+          <w:numId w:val="1003"/>
         </w:numPr>
       </w:pPr>
       <w:r>
@@ -277,7 +935,7 @@
       <w:r>
         <w:t xml:space="preserve">(</w:t>
       </w:r>
-      <w:hyperlink r:id="rId13">
+      <w:hyperlink r:id="rId18">
         <w:r>
           <w:rPr>
             <w:rStyle w:val="Hyperlink"/>
@@ -292,511 +950,7 @@
         <w:t xml:space="preserve"> </w:t>
       </w:r>
       <w:r>
-        <w:t xml:space="preserve">which the list names as its own key source</w:t>
-      </w:r>
-    </w:p>
-    <w:p>
-      <w:pPr>
-        <w:pStyle w:val="Compact"/>
-        <w:numPr>
-          <w:ilvl w:val="0"/>
-          <w:numId w:val="1001"/>
-        </w:numPr>
-      </w:pPr>
-      <w:r>
-        <w:rPr>
-          <w:b/>
-          <w:bCs/>
-        </w:rPr>
-        <w:t xml:space="preserve">Mathematical tasks</w:t>
-      </w:r>
-      <w:r>
-        <w:t xml:space="preserve">, from number representation and arithmetic</w:t>
-      </w:r>
-      <w:r>
-        <w:t xml:space="preserve"> </w:t>
-      </w:r>
-      <w:r>
-        <w:t xml:space="preserve">through word problems, competition math, and formal theorem proving</w:t>
-      </w:r>
-    </w:p>
-    <w:p>
-      <w:pPr>
-        <w:pStyle w:val="Compact"/>
-        <w:numPr>
-          <w:ilvl w:val="0"/>
-          <w:numId w:val="1001"/>
-        </w:numPr>
-      </w:pPr>
-      <w:r>
-        <w:rPr>
-          <w:b/>
-          <w:bCs/>
-        </w:rPr>
-        <w:t xml:space="preserve">Reasoning techniques</w:t>
-      </w:r>
-      <w:r>
-        <w:t xml:space="preserve">: chain-of-thought and prompting,</w:t>
-      </w:r>
-      <w:r>
-        <w:t xml:space="preserve"> </w:t>
-      </w:r>
-      <w:r>
-        <w:t xml:space="preserve">search and planning, reinforcement learning and reward modeling,</w:t>
-      </w:r>
-      <w:r>
-        <w:t xml:space="preserve"> </w:t>
-      </w:r>
-      <w:r>
-        <w:t xml:space="preserve">self-improvement, tool use, and integration with symbolic solvers</w:t>
-      </w:r>
-    </w:p>
-    <w:p>
-      <w:pPr>
-        <w:pStyle w:val="Compact"/>
-        <w:numPr>
-          <w:ilvl w:val="0"/>
-          <w:numId w:val="1001"/>
-        </w:numPr>
-      </w:pPr>
-      <w:r>
-        <w:rPr>
-          <w:b/>
-          <w:bCs/>
-        </w:rPr>
-        <w:t xml:space="preserve">Multimodal mathematical reasoning</w:t>
-      </w:r>
-      <w:r>
-        <w:t xml:space="preserve">, for problems that include figures or diagrams</w:t>
-      </w:r>
-    </w:p>
-    <w:p>
-      <w:pPr>
-        <w:pStyle w:val="Compact"/>
-        <w:numPr>
-          <w:ilvl w:val="0"/>
-          <w:numId w:val="1001"/>
-        </w:numPr>
-      </w:pPr>
-      <w:r>
-        <w:rPr>
-          <w:b/>
-          <w:bCs/>
-        </w:rPr>
-        <w:t xml:space="preserve">Models</w:t>
-      </w:r>
-      <w:r>
-        <w:t xml:space="preserve">, split into math-specialized models</w:t>
-      </w:r>
-      <w:r>
-        <w:t xml:space="preserve"> </w:t>
-      </w:r>
-      <w:r>
-        <w:t xml:space="preserve">(for example</w:t>
-      </w:r>
-      <w:r>
-        <w:t xml:space="preserve"> </w:t>
-      </w:r>
-      <w:r>
-        <w:rPr>
-          <w:rStyle w:val="VerbatimChar"/>
-        </w:rPr>
-        <w:t xml:space="preserve">DeepSeekMath</w:t>
-      </w:r>
-      <w:r>
-        <w:t xml:space="preserve">,</w:t>
-      </w:r>
-      <w:r>
-        <w:t xml:space="preserve"> </w:t>
-      </w:r>
-      <w:r>
-        <w:rPr>
-          <w:rStyle w:val="VerbatimChar"/>
-        </w:rPr>
-        <w:t xml:space="preserve">Qwen2.5-Math</w:t>
-      </w:r>
-      <w:r>
-        <w:t xml:space="preserve">,</w:t>
-      </w:r>
-      <w:r>
-        <w:t xml:space="preserve"> </w:t>
-      </w:r>
-      <w:r>
-        <w:rPr>
-          <w:rStyle w:val="VerbatimChar"/>
-        </w:rPr>
-        <w:t xml:space="preserve">Llemma</w:t>
-      </w:r>
-      <w:r>
-        <w:t xml:space="preserve">, and Minerva),</w:t>
-      </w:r>
-      <w:r>
-        <w:t xml:space="preserve"> </w:t>
-      </w:r>
-      <w:r>
-        <w:t xml:space="preserve">reasoning-focused models</w:t>
-      </w:r>
-      <w:r>
-        <w:t xml:space="preserve"> </w:t>
-      </w:r>
-      <w:r>
-        <w:t xml:space="preserve">(</w:t>
-      </w:r>
-      <w:r>
-        <w:rPr>
-          <w:rStyle w:val="VerbatimChar"/>
-        </w:rPr>
-        <w:t xml:space="preserve">rStar-Math</w:t>
-      </w:r>
-      <w:r>
-        <w:t xml:space="preserve">, DeepSeek R1, OpenAI o1, and</w:t>
-      </w:r>
-      <w:r>
-        <w:t xml:space="preserve"> </w:t>
-      </w:r>
-      <w:r>
-        <w:rPr>
-          <w:rStyle w:val="VerbatimChar"/>
-        </w:rPr>
-        <w:t xml:space="preserve">QwQ-32B</w:t>
-      </w:r>
-      <w:r>
-        <w:t xml:space="preserve">),</w:t>
-      </w:r>
-      <w:r>
-        <w:t xml:space="preserve"> </w:t>
-      </w:r>
-      <w:r>
-        <w:t xml:space="preserve">and the leading general models each vendor reports on math benchmarks</w:t>
-      </w:r>
-    </w:p>
-    <w:p>
-      <w:pPr>
-        <w:pStyle w:val="Compact"/>
-        <w:numPr>
-          <w:ilvl w:val="0"/>
-          <w:numId w:val="1001"/>
-        </w:numPr>
-      </w:pPr>
-      <w:r>
-        <w:rPr>
-          <w:b/>
-          <w:bCs/>
-        </w:rPr>
-        <w:t xml:space="preserve">Datasets and benchmarks</w:t>
-      </w:r>
-      <w:r>
-        <w:t xml:space="preserve">, grouped by level:</w:t>
-      </w:r>
-      <w:r>
-        <w:t xml:space="preserve"> </w:t>
-      </w:r>
-      <w:r>
-        <w:t xml:space="preserve">grade-school word problems (</w:t>
-      </w:r>
-      <w:r>
-        <w:rPr>
-          <w:rStyle w:val="VerbatimChar"/>
-        </w:rPr>
-        <w:t xml:space="preserve">GSM8K</w:t>
-      </w:r>
-      <w:r>
-        <w:t xml:space="preserve">,</w:t>
-      </w:r>
-      <w:r>
-        <w:t xml:space="preserve"> </w:t>
-      </w:r>
-      <w:r>
-        <w:rPr>
-          <w:rStyle w:val="VerbatimChar"/>
-        </w:rPr>
-        <w:t xml:space="preserve">SVAMP</w:t>
-      </w:r>
-      <w:r>
-        <w:t xml:space="preserve">), competition and university level</w:t>
-      </w:r>
-      <w:r>
-        <w:t xml:space="preserve"> </w:t>
-      </w:r>
-      <w:r>
-        <w:t xml:space="preserve">(</w:t>
-      </w:r>
-      <w:r>
-        <w:rPr>
-          <w:rStyle w:val="VerbatimChar"/>
-        </w:rPr>
-        <w:t xml:space="preserve">MATH</w:t>
-      </w:r>
-      <w:r>
-        <w:t xml:space="preserve">,</w:t>
-      </w:r>
-      <w:r>
-        <w:t xml:space="preserve"> </w:t>
-      </w:r>
-      <w:r>
-        <w:rPr>
-          <w:rStyle w:val="VerbatimChar"/>
-        </w:rPr>
-        <w:t xml:space="preserve">AIME</w:t>
-      </w:r>
-      <w:r>
-        <w:t xml:space="preserve">,</w:t>
-      </w:r>
-      <w:r>
-        <w:t xml:space="preserve"> </w:t>
-      </w:r>
-      <w:r>
-        <w:rPr>
-          <w:rStyle w:val="VerbatimChar"/>
-        </w:rPr>
-        <w:t xml:space="preserve">MMLU-Pro</w:t>
-      </w:r>
-      <w:r>
-        <w:t xml:space="preserve">,</w:t>
-      </w:r>
-      <w:r>
-        <w:t xml:space="preserve"> </w:t>
-      </w:r>
-      <w:r>
-        <w:rPr>
-          <w:rStyle w:val="VerbatimChar"/>
-        </w:rPr>
-        <w:t xml:space="preserve">GPQA</w:t>
-      </w:r>
-      <w:r>
-        <w:t xml:space="preserve">), theorem proving (</w:t>
-      </w:r>
-      <w:r>
-        <w:rPr>
-          <w:rStyle w:val="VerbatimChar"/>
-        </w:rPr>
-        <w:t xml:space="preserve">miniF2F</w:t>
-      </w:r>
-      <w:r>
-        <w:t xml:space="preserve">,</w:t>
-      </w:r>
-      <w:r>
-        <w:t xml:space="preserve"> </w:t>
-      </w:r>
-      <w:r>
-        <w:rPr>
-          <w:rStyle w:val="VerbatimChar"/>
-        </w:rPr>
-        <w:t xml:space="preserve">ProofNet</w:t>
-      </w:r>
-      <w:r>
-        <w:t xml:space="preserve">),</w:t>
-      </w:r>
-      <w:r>
-        <w:t xml:space="preserve"> </w:t>
-      </w:r>
-      <w:r>
-        <w:t xml:space="preserve">multimodal, and the training and synthetic sets</w:t>
-      </w:r>
-    </w:p>
-    <w:p>
-      <w:pPr>
-        <w:pStyle w:val="Compact"/>
-        <w:numPr>
-          <w:ilvl w:val="0"/>
-          <w:numId w:val="1001"/>
-        </w:numPr>
-      </w:pPr>
-      <w:r>
-        <w:rPr>
-          <w:b/>
-          <w:bCs/>
-        </w:rPr>
-        <w:t xml:space="preserve">Tools and libraries</w:t>
-      </w:r>
-      <w:r>
-        <w:t xml:space="preserve">, which pairs LLM tooling</w:t>
-      </w:r>
-      <w:r>
-        <w:t xml:space="preserve"> </w:t>
-      </w:r>
-      <w:r>
-        <w:t xml:space="preserve">(</w:t>
-      </w:r>
-      <w:r>
-        <w:rPr>
-          <w:rStyle w:val="VerbatimChar"/>
-        </w:rPr>
-        <w:t xml:space="preserve">OpenCompass</w:t>
-      </w:r>
-      <w:r>
-        <w:t xml:space="preserve"> </w:t>
-      </w:r>
-      <w:r>
-        <w:t xml:space="preserve">for evaluation, LoRA for fine-tuning)</w:t>
-      </w:r>
-      <w:r>
-        <w:t xml:space="preserve"> </w:t>
-      </w:r>
-      <w:r>
-        <w:t xml:space="preserve">with the interactive theorem-proving assistants Lean, Isabelle, and</w:t>
-      </w:r>
-      <w:r>
-        <w:t xml:space="preserve"> </w:t>
-      </w:r>
-      <w:r>
-        <w:rPr>
-          <w:rStyle w:val="VerbatimChar"/>
-        </w:rPr>
-        <w:t xml:space="preserve">Coq</w:t>
-      </w:r>
-    </w:p>
-    <w:p>
-      <w:pPr>
-        <w:pStyle w:val="FirstParagraph"/>
-      </w:pPr>
-      <w:r>
-        <w:t xml:space="preserve">Most entries carry a paper title, links, and a month-and-year date;</w:t>
-      </w:r>
-      <w:r>
-        <w:t xml:space="preserve"> </w:t>
-      </w:r>
-      <w:r>
-        <w:t xml:space="preserve">the tool entries and the related-lists entries carry a name and a link only.</w:t>
-      </w:r>
-    </w:p>
-    <w:bookmarkEnd w:id="14"/>
-    <w:bookmarkStart w:id="15" w:name="what-to-read-with-care"/>
-    <w:p>
-      <w:pPr>
-        <w:pStyle w:val="Heading2"/>
-      </w:pPr>
-      <w:r>
-        <w:t xml:space="preserve">1.2 What to read with care</w:t>
-      </w:r>
-    </w:p>
-    <w:p>
-      <w:pPr>
-        <w:pStyle w:val="Compact"/>
-        <w:numPr>
-          <w:ilvl w:val="0"/>
-          <w:numId w:val="1002"/>
-        </w:numPr>
-      </w:pPr>
-      <w:r>
-        <w:t xml:space="preserve">The</w:t>
-      </w:r>
-      <w:r>
-        <w:t xml:space="preserve"> </w:t>
-      </w:r>
-      <w:r>
-        <w:t xml:space="preserve">“Recent Highlights”</w:t>
-      </w:r>
-      <w:r>
-        <w:t xml:space="preserve"> </w:t>
-      </w:r>
-      <w:r>
-        <w:t xml:space="preserve">block at the top carries the maintainer’s own note</w:t>
-      </w:r>
-      <w:r>
-        <w:t xml:space="preserve"> </w:t>
-      </w:r>
-      <w:r>
-        <w:t xml:space="preserve">that its dates</w:t>
-      </w:r>
-      <w:r>
-        <w:t xml:space="preserve"> </w:t>
-      </w:r>
-      <w:r>
-        <w:t xml:space="preserve">“appear to be futuristic”</w:t>
-      </w:r>
-      <w:r>
-        <w:t xml:space="preserve">,</w:t>
-      </w:r>
-      <w:r>
-        <w:t xml:space="preserve"> </w:t>
-      </w:r>
-      <w:r>
-        <w:t xml:space="preserve">so treat a date there as unreliable until checked against the paper.</w:t>
-      </w:r>
-    </w:p>
-    <w:p>
-      <w:pPr>
-        <w:pStyle w:val="Compact"/>
-        <w:numPr>
-          <w:ilvl w:val="0"/>
-          <w:numId w:val="1002"/>
-        </w:numPr>
-      </w:pPr>
-      <w:r>
-        <w:t xml:space="preserve">Several entries appear under more than one section</w:t>
-      </w:r>
-      <w:r>
-        <w:t xml:space="preserve"> </w:t>
-      </w:r>
-      <w:r>
-        <w:t xml:space="preserve">(</w:t>
-      </w:r>
-      <w:r>
-        <w:rPr>
-          <w:rStyle w:val="VerbatimChar"/>
-        </w:rPr>
-        <w:t xml:space="preserve">AlphaGeometry</w:t>
-      </w:r>
-      <w:r>
-        <w:t xml:space="preserve"> </w:t>
-      </w:r>
-      <w:r>
-        <w:t xml:space="preserve">under both geometry and competition math, for instance),</w:t>
-      </w:r>
-      <w:r>
-        <w:t xml:space="preserve"> </w:t>
-      </w:r>
-      <w:r>
-        <w:t xml:space="preserve">which is deliberate cross-listing rather than an error,</w:t>
-      </w:r>
-      <w:r>
-        <w:t xml:space="preserve"> </w:t>
-      </w:r>
-      <w:r>
-        <w:t xml:space="preserve">and the entry counts above include those repeats.</w:t>
-      </w:r>
-    </w:p>
-    <w:p>
-      <w:pPr>
-        <w:pStyle w:val="Compact"/>
-        <w:numPr>
-          <w:ilvl w:val="0"/>
-          <w:numId w:val="1002"/>
-        </w:numPr>
-      </w:pPr>
-      <w:r>
-        <w:t xml:space="preserve">The list records what exists rather than what works:</w:t>
-      </w:r>
-      <w:r>
-        <w:t xml:space="preserve"> </w:t>
-      </w:r>
-      <w:r>
-        <w:t xml:space="preserve">it makes no recommendations and ranks nothing,</w:t>
-      </w:r>
-      <w:r>
-        <w:t xml:space="preserve"> </w:t>
-      </w:r>
-      <w:r>
-        <w:t xml:space="preserve">so the benchmark section is the place to start when a claim about a model’s mathematical ability needs a source.</w:t>
-      </w:r>
-    </w:p>
-    <w:bookmarkEnd w:id="15"/>
-    <w:bookmarkStart w:id="16" w:name="X4d7a086ff76db927a6b39dd8bd078b875532764"/>
-    <w:p>
-      <w:pPr>
-        <w:pStyle w:val="Heading2"/>
-      </w:pPr>
-      <w:r>
-        <w:t xml:space="preserve">1.3 Useful to us? As a map, not a recommendation</w:t>
-      </w:r>
-    </w:p>
-    <w:p>
-      <w:pPr>
-        <w:pStyle w:val="FirstParagraph"/>
-      </w:pPr>
-      <w:r>
-        <w:t xml:space="preserve">For a statistics lab the list is most useful in three ways:</w:t>
+        <w:t xml:space="preserve">which the list names as its key foundational survey.</w:t>
       </w:r>
     </w:p>
     <w:p>
@@ -812,43 +966,16 @@
           <w:b/>
           <w:bCs/>
         </w:rPr>
-        <w:t xml:space="preserve">Choosing a model for a derivation-heavy task.</w:t>
-      </w:r>
-      <w:r>
-        <w:t xml:space="preserve"> </w:t>
-      </w:r>
-      <w:r>
-        <w:t xml:space="preserve">The reasoning-focused and math-specialized model sections</w:t>
-      </w:r>
-      <w:r>
-        <w:t xml:space="preserve"> </w:t>
-      </w:r>
-      <w:r>
-        <w:t xml:space="preserve">name the models whose math benchmark results are published,</w:t>
-      </w:r>
-      <w:r>
-        <w:t xml:space="preserve"> </w:t>
-      </w:r>
-      <w:r>
-        <w:t xml:space="preserve">and the benchmark section names the tests those results come from,</w:t>
-      </w:r>
-      <w:r>
-        <w:t xml:space="preserve"> </w:t>
-      </w:r>
-      <w:r>
-        <w:t xml:space="preserve">so a claim such as</w:t>
-      </w:r>
-      <w:r>
-        <w:t xml:space="preserve"> </w:t>
-      </w:r>
-      <w:r>
-        <w:t xml:space="preserve">“model X is strong at math”</w:t>
-      </w:r>
-      <w:r>
-        <w:t xml:space="preserve"> </w:t>
-      </w:r>
-      <w:r>
-        <w:t xml:space="preserve">can be tied to a number.</w:t>
+        <w:t xml:space="preserve">Mathematical tasks</w:t>
+      </w:r>
+      <w:r>
+        <w:t xml:space="preserve">, from number representation and arithmetic</w:t>
+      </w:r>
+      <w:r>
+        <w:t xml:space="preserve"> </w:t>
+      </w:r>
+      <w:r>
+        <w:t xml:space="preserve">through word problems, competition math, and formal theorem proving.</w:t>
       </w:r>
     </w:p>
     <w:p>
@@ -864,49 +991,22 @@
           <w:b/>
           <w:bCs/>
         </w:rPr>
-        <w:t xml:space="preserve">Understanding why an assistant gets a calculation wrong.</w:t>
-      </w:r>
-      <w:r>
-        <w:t xml:space="preserve"> </w:t>
-      </w:r>
-      <w:r>
-        <w:t xml:space="preserve">The fundamental-calculation section collects the papers on how models split and represent numbers</w:t>
-      </w:r>
-      <w:r>
-        <w:t xml:space="preserve"> </w:t>
-      </w:r>
-      <w:r>
-        <w:t xml:space="preserve">that explain arithmetic failures,</w:t>
-      </w:r>
-      <w:r>
-        <w:t xml:space="preserve"> </w:t>
-      </w:r>
-      <w:r>
-        <w:t xml:space="preserve">and the tool-use section collects the approaches</w:t>
-      </w:r>
-      <w:r>
-        <w:t xml:space="preserve"> </w:t>
-      </w:r>
-      <w:r>
-        <w:t xml:space="preserve">(calling a calculator, running code, consulting a solver)</w:t>
-      </w:r>
-      <w:r>
-        <w:t xml:space="preserve"> </w:t>
-      </w:r>
-      <w:r>
-        <w:t xml:space="preserve">that fix them,</w:t>
-      </w:r>
-      <w:r>
-        <w:t xml:space="preserve"> </w:t>
-      </w:r>
-      <w:r>
-        <w:t xml:space="preserve">which is the pattern this lab already follows</w:t>
-      </w:r>
-      <w:r>
-        <w:t xml:space="preserve"> </w:t>
-      </w:r>
-      <w:r>
-        <w:t xml:space="preserve">by having an agent run R rather than reason about numbers in prose.</w:t>
+        <w:t xml:space="preserve">Reasoning techniques</w:t>
+      </w:r>
+      <w:r>
+        <w:t xml:space="preserve">: chain-of-thought prompting,</w:t>
+      </w:r>
+      <w:r>
+        <w:t xml:space="preserve"> </w:t>
+      </w:r>
+      <w:r>
+        <w:t xml:space="preserve">search and planning (MCTS), reinforcement learning and process reward modeling (PRMs),</w:t>
+      </w:r>
+      <w:r>
+        <w:t xml:space="preserve"> </w:t>
+      </w:r>
+      <w:r>
+        <w:t xml:space="preserve">self-improvement, tool use, and symbolic solver integration.</w:t>
       </w:r>
     </w:p>
     <w:p>
@@ -922,40 +1022,341 @@
           <w:b/>
           <w:bCs/>
         </w:rPr>
-        <w:t xml:space="preserve">Formal verification as a direction to watch.</w:t>
-      </w:r>
-      <w:r>
-        <w:t xml:space="preserve"> </w:t>
-      </w:r>
-      <w:r>
-        <w:t xml:space="preserve">The theorem-proving entries and the Lean, Isabelle, and</w:t>
-      </w:r>
-      <w:r>
-        <w:t xml:space="preserve"> </w:t>
+        <w:t xml:space="preserve">Multimodal mathematical reasoning</w:t>
+      </w:r>
+      <w:r>
+        <w:t xml:space="preserve">, covering visual geometry and chart interpretation.</w:t>
+      </w:r>
+    </w:p>
+    <w:p>
+      <w:pPr>
+        <w:pStyle w:val="Compact"/>
+        <w:numPr>
+          <w:ilvl w:val="0"/>
+          <w:numId w:val="1003"/>
+        </w:numPr>
+      </w:pPr>
+      <w:r>
+        <w:rPr>
+          <w:b/>
+          <w:bCs/>
+        </w:rPr>
+        <w:t xml:space="preserve">Specialized models</w:t>
+      </w:r>
+      <w:r>
+        <w:t xml:space="preserve">: domain-specialized weights</w:t>
+      </w:r>
+      <w:r>
+        <w:t xml:space="preserve"> </w:t>
+      </w:r>
+      <w:r>
+        <w:t xml:space="preserve">(</w:t>
       </w:r>
       <w:r>
         <w:rPr>
           <w:rStyle w:val="VerbatimChar"/>
         </w:rPr>
-        <w:t xml:space="preserve">Coq</w:t>
-      </w:r>
-      <w:r>
-        <w:t xml:space="preserve"> </w:t>
-      </w:r>
-      <w:r>
-        <w:t xml:space="preserve">tools</w:t>
-      </w:r>
-      <w:r>
-        <w:t xml:space="preserve"> </w:t>
-      </w:r>
-      <w:r>
-        <w:t xml:space="preserve">describe machine-checked proofs,</w:t>
-      </w:r>
-      <w:r>
-        <w:t xml:space="preserve"> </w:t>
-      </w:r>
-      <w:r>
-        <w:t xml:space="preserve">which is the standard a statistical derivation could eventually be held to.</w:t>
+        <w:t xml:space="preserve">DeepSeekMath</w:t>
+      </w:r>
+      <w:r>
+        <w:t xml:space="preserve">,</w:t>
+      </w:r>
+      <w:r>
+        <w:t xml:space="preserve"> </w:t>
+      </w:r>
+      <w:r>
+        <w:rPr>
+          <w:rStyle w:val="VerbatimChar"/>
+        </w:rPr>
+        <w:t xml:space="preserve">Qwen2.5-Math</w:t>
+      </w:r>
+      <w:r>
+        <w:t xml:space="preserve">,</w:t>
+      </w:r>
+      <w:r>
+        <w:t xml:space="preserve"> </w:t>
+      </w:r>
+      <w:r>
+        <w:rPr>
+          <w:rStyle w:val="VerbatimChar"/>
+        </w:rPr>
+        <w:t xml:space="preserve">Llemma</w:t>
+      </w:r>
+      <w:r>
+        <w:t xml:space="preserve">, Minerva) and general reasoning architectures</w:t>
+      </w:r>
+      <w:r>
+        <w:t xml:space="preserve"> </w:t>
+      </w:r>
+      <w:r>
+        <w:t xml:space="preserve">(</w:t>
+      </w:r>
+      <w:r>
+        <w:rPr>
+          <w:rStyle w:val="VerbatimChar"/>
+        </w:rPr>
+        <w:t xml:space="preserve">rStar-Math</w:t>
+      </w:r>
+      <w:r>
+        <w:t xml:space="preserve">, DeepSeek-R1, OpenAI o1,</w:t>
+      </w:r>
+      <w:r>
+        <w:t xml:space="preserve"> </w:t>
+      </w:r>
+      <w:r>
+        <w:rPr>
+          <w:rStyle w:val="VerbatimChar"/>
+        </w:rPr>
+        <w:t xml:space="preserve">QwQ-32B</w:t>
+      </w:r>
+      <w:r>
+        <w:t xml:space="preserve">).</w:t>
+      </w:r>
+    </w:p>
+    <w:p>
+      <w:pPr>
+        <w:pStyle w:val="Compact"/>
+        <w:numPr>
+          <w:ilvl w:val="0"/>
+          <w:numId w:val="1003"/>
+        </w:numPr>
+      </w:pPr>
+      <w:r>
+        <w:rPr>
+          <w:b/>
+          <w:bCs/>
+        </w:rPr>
+        <w:t xml:space="preserve">Datasets and benchmarks</w:t>
+      </w:r>
+      <w:r>
+        <w:t xml:space="preserve">, spanning elementary arithmetic (</w:t>
+      </w:r>
+      <w:r>
+        <w:rPr>
+          <w:rStyle w:val="VerbatimChar"/>
+        </w:rPr>
+        <w:t xml:space="preserve">GSM8K</w:t>
+      </w:r>
+      <w:r>
+        <w:t xml:space="preserve">),</w:t>
+      </w:r>
+      <w:r>
+        <w:t xml:space="preserve"> </w:t>
+      </w:r>
+      <w:r>
+        <w:t xml:space="preserve">competition problem sets (</w:t>
+      </w:r>
+      <w:r>
+        <w:rPr>
+          <w:rStyle w:val="VerbatimChar"/>
+        </w:rPr>
+        <w:t xml:space="preserve">MATH</w:t>
+      </w:r>
+      <w:r>
+        <w:t xml:space="preserve">,</w:t>
+      </w:r>
+      <w:r>
+        <w:t xml:space="preserve"> </w:t>
+      </w:r>
+      <w:r>
+        <w:rPr>
+          <w:rStyle w:val="VerbatimChar"/>
+        </w:rPr>
+        <w:t xml:space="preserve">AIME</w:t>
+      </w:r>
+      <w:r>
+        <w:t xml:space="preserve">), and formal verification corpora (</w:t>
+      </w:r>
+      <w:r>
+        <w:rPr>
+          <w:rStyle w:val="VerbatimChar"/>
+        </w:rPr>
+        <w:t xml:space="preserve">MiniF2F</w:t>
+      </w:r>
+      <w:r>
+        <w:t xml:space="preserve">,</w:t>
+      </w:r>
+      <w:r>
+        <w:t xml:space="preserve"> </w:t>
+      </w:r>
+      <w:r>
+        <w:rPr>
+          <w:rStyle w:val="VerbatimChar"/>
+        </w:rPr>
+        <w:t xml:space="preserve">ProofNet</w:t>
+      </w:r>
+      <w:r>
+        <w:t xml:space="preserve">).</w:t>
+      </w:r>
+    </w:p>
+    <w:p>
+      <w:pPr>
+        <w:pStyle w:val="Compact"/>
+        <w:numPr>
+          <w:ilvl w:val="0"/>
+          <w:numId w:val="1003"/>
+        </w:numPr>
+      </w:pPr>
+      <w:r>
+        <w:rPr>
+          <w:b/>
+          <w:bCs/>
+        </w:rPr>
+        <w:t xml:space="preserve">Interactive Provers and Tooling</w:t>
+      </w:r>
+      <w:r>
+        <w:t xml:space="preserve">: pairing evaluation frameworks (</w:t>
+      </w:r>
+      <w:r>
+        <w:rPr>
+          <w:rStyle w:val="VerbatimChar"/>
+        </w:rPr>
+        <w:t xml:space="preserve">OpenCompass</w:t>
+      </w:r>
+      <w:r>
+        <w:t xml:space="preserve">)</w:t>
+      </w:r>
+      <w:r>
+        <w:t xml:space="preserve"> </w:t>
+      </w:r>
+      <w:r>
+        <w:t xml:space="preserve">with formal proof assistants (</w:t>
+      </w:r>
+      <w:hyperlink r:id="rId15">
+        <w:r>
+          <w:rPr>
+            <w:rStyle w:val="Hyperlink"/>
+          </w:rPr>
+          <w:t xml:space="preserve">Lean 4</w:t>
+        </w:r>
+      </w:hyperlink>
+      <w:r>
+        <w:t xml:space="preserve">, Isabelle, Coq).</w:t>
+      </w:r>
+    </w:p>
+    <w:bookmarkEnd w:id="19"/>
+    <w:bookmarkStart w:id="20" w:name="what-to-read-with-care"/>
+    <w:p>
+      <w:pPr>
+        <w:pStyle w:val="Heading2"/>
+      </w:pPr>
+      <w:r>
+        <w:t xml:space="preserve">3.2 What to read with care</w:t>
+      </w:r>
+    </w:p>
+    <w:p>
+      <w:pPr>
+        <w:pStyle w:val="Compact"/>
+        <w:numPr>
+          <w:ilvl w:val="0"/>
+          <w:numId w:val="1004"/>
+        </w:numPr>
+      </w:pPr>
+      <w:r>
+        <w:t xml:space="preserve">The</w:t>
+      </w:r>
+      <w:r>
+        <w:t xml:space="preserve"> </w:t>
+      </w:r>
+      <w:r>
+        <w:t xml:space="preserve">“Recent Highlights”</w:t>
+      </w:r>
+      <w:r>
+        <w:t xml:space="preserve"> </w:t>
+      </w:r>
+      <w:r>
+        <w:t xml:space="preserve">block at the top carries the maintainer’s own note</w:t>
+      </w:r>
+      <w:r>
+        <w:t xml:space="preserve"> </w:t>
+      </w:r>
+      <w:r>
+        <w:t xml:space="preserve">that its dates</w:t>
+      </w:r>
+      <w:r>
+        <w:t xml:space="preserve"> </w:t>
+      </w:r>
+      <w:r>
+        <w:t xml:space="preserve">“appear to be futuristic”</w:t>
+      </w:r>
+      <w:r>
+        <w:t xml:space="preserve">,</w:t>
+      </w:r>
+      <w:r>
+        <w:t xml:space="preserve"> </w:t>
+      </w:r>
+      <w:r>
+        <w:t xml:space="preserve">so treat a date there as unreliable until checked against the primary paper.</w:t>
+      </w:r>
+    </w:p>
+    <w:p>
+      <w:pPr>
+        <w:pStyle w:val="Compact"/>
+        <w:numPr>
+          <w:ilvl w:val="0"/>
+          <w:numId w:val="1004"/>
+        </w:numPr>
+      </w:pPr>
+      <w:r>
+        <w:t xml:space="preserve">Several entries appear under more than one section</w:t>
+      </w:r>
+      <w:r>
+        <w:t xml:space="preserve"> </w:t>
+      </w:r>
+      <w:r>
+        <w:t xml:space="preserve">(</w:t>
+      </w:r>
+      <w:r>
+        <w:rPr>
+          <w:rStyle w:val="VerbatimChar"/>
+        </w:rPr>
+        <w:t xml:space="preserve">AlphaGeometry</w:t>
+      </w:r>
+      <w:r>
+        <w:t xml:space="preserve"> </w:t>
+      </w:r>
+      <w:r>
+        <w:t xml:space="preserve">under both geometry and competition math, for instance),</w:t>
+      </w:r>
+      <w:r>
+        <w:t xml:space="preserve"> </w:t>
+      </w:r>
+      <w:r>
+        <w:t xml:space="preserve">which is deliberate cross-listing rather than an error.</w:t>
+      </w:r>
+    </w:p>
+    <w:p>
+      <w:pPr>
+        <w:pStyle w:val="Compact"/>
+        <w:numPr>
+          <w:ilvl w:val="0"/>
+          <w:numId w:val="1004"/>
+        </w:numPr>
+      </w:pPr>
+      <w:r>
+        <w:t xml:space="preserve">The list records what exists rather than ranking what works:</w:t>
+      </w:r>
+      <w:r>
+        <w:t xml:space="preserve"> </w:t>
+      </w:r>
+      <w:r>
+        <w:t xml:space="preserve">it makes no qualitative recommendations,</w:t>
+      </w:r>
+      <w:r>
+        <w:t xml:space="preserve"> </w:t>
+      </w:r>
+      <w:r>
+        <w:t xml:space="preserve">so the benchmark section is the place to start when evaluating model accuracy.</w:t>
+      </w:r>
+    </w:p>
+    <w:bookmarkEnd w:id="20"/>
+    <w:bookmarkStart w:id="21" w:name="reading-guidance-for-research-labs"/>
+    <w:p>
+      <w:pPr>
+        <w:pStyle w:val="Heading2"/>
+      </w:pPr>
+      <w:r>
+        <w:t xml:space="preserve">3.3 Reading Guidance for Research Labs</w:t>
       </w:r>
     </w:p>
     <w:p>
@@ -963,29 +1364,295 @@
         <w:pStyle w:val="FirstParagraph"/>
       </w:pPr>
       <w:r>
-        <w:t xml:space="preserve">Its limits for us are that statistics appears only through general math benchmarks,</w:t>
-      </w:r>
-      <w:r>
-        <w:t xml:space="preserve"> </w:t>
-      </w:r>
-      <w:r>
-        <w:t xml:space="preserve">none of the entries evaluate applied statistical reasoning specifically,</w:t>
-      </w:r>
-      <w:r>
-        <w:t xml:space="preserve"> </w:t>
-      </w:r>
-      <w:r>
-        <w:t xml:space="preserve">and the list stops at collection:</w:t>
-      </w:r>
-      <w:r>
-        <w:t xml:space="preserve"> </w:t>
-      </w:r>
-      <w:r>
-        <w:t xml:space="preserve">comparing the models it names is work for the reader.</w:t>
-      </w:r>
-    </w:p>
-    <w:bookmarkEnd w:id="16"/>
-    <w:bookmarkEnd w:id="17"/>
+        <w:t xml:space="preserve">For a computational and statistical laboratory, the repository serves as an architectural index:</w:t>
+      </w:r>
+    </w:p>
+    <w:p>
+      <w:pPr>
+        <w:pStyle w:val="Compact"/>
+        <w:numPr>
+          <w:ilvl w:val="0"/>
+          <w:numId w:val="1005"/>
+        </w:numPr>
+      </w:pPr>
+      <w:r>
+        <w:rPr>
+          <w:b/>
+          <w:bCs/>
+        </w:rPr>
+        <w:t xml:space="preserve">Model Selection for Analytical Derivations</w:t>
+      </w:r>
+      <w:r>
+        <w:t xml:space="preserve">:</w:t>
+      </w:r>
+      <w:r>
+        <w:t xml:space="preserve"> </w:t>
+      </w:r>
+      <w:r>
+        <w:t xml:space="preserve">The reasoning and math-specialized model categories allow matching tasks to models</w:t>
+      </w:r>
+      <w:r>
+        <w:t xml:space="preserve"> </w:t>
+      </w:r>
+      <w:r>
+        <w:t xml:space="preserve">with verified benchmark performance on similar algebraic complexity.</w:t>
+      </w:r>
+    </w:p>
+    <w:p>
+      <w:pPr>
+        <w:pStyle w:val="Compact"/>
+        <w:numPr>
+          <w:ilvl w:val="0"/>
+          <w:numId w:val="1005"/>
+        </w:numPr>
+      </w:pPr>
+      <w:r>
+        <w:rPr>
+          <w:b/>
+          <w:bCs/>
+        </w:rPr>
+        <w:t xml:space="preserve">Diagnosing Arithmetic Failures</w:t>
+      </w:r>
+      <w:r>
+        <w:t xml:space="preserve">:</w:t>
+      </w:r>
+      <w:r>
+        <w:t xml:space="preserve"> </w:t>
+      </w:r>
+      <w:r>
+        <w:t xml:space="preserve">The number-representation literature explains why pure autoregressive decoding fails on tokenized digits,</w:t>
+      </w:r>
+      <w:r>
+        <w:t xml:space="preserve"> </w:t>
+      </w:r>
+      <w:r>
+        <w:t xml:space="preserve">motivating execution-backed tool patterns (such as executing R or Python subprocesses).</w:t>
+      </w:r>
+    </w:p>
+    <w:p>
+      <w:pPr>
+        <w:pStyle w:val="Compact"/>
+        <w:numPr>
+          <w:ilvl w:val="0"/>
+          <w:numId w:val="1005"/>
+        </w:numPr>
+      </w:pPr>
+      <w:r>
+        <w:rPr>
+          <w:b/>
+          <w:bCs/>
+        </w:rPr>
+        <w:t xml:space="preserve">Formal Verification Horizons</w:t>
+      </w:r>
+      <w:r>
+        <w:t xml:space="preserve">:</w:t>
+      </w:r>
+      <w:r>
+        <w:t xml:space="preserve"> </w:t>
+      </w:r>
+      <w:r>
+        <w:t xml:space="preserve">The interactive theorem proving resources indicate the direction towards mechanically</w:t>
+      </w:r>
+      <w:r>
+        <w:t xml:space="preserve"> </w:t>
+      </w:r>
+      <w:r>
+        <w:t xml:space="preserve">verified mathematical proofs in statistical theory.</w:t>
+      </w:r>
+    </w:p>
+    <w:bookmarkEnd w:id="21"/>
+    <w:bookmarkEnd w:id="22"/>
+    <w:bookmarkStart w:id="23" w:name="sec-ai-math-guidance"/>
+    <w:p>
+      <w:pPr>
+        <w:pStyle w:val="Heading1"/>
+      </w:pPr>
+      <w:r>
+        <w:t xml:space="preserve">4. Practical Guidance for Mathematics and Statistics</w:t>
+      </w:r>
+    </w:p>
+    <w:p>
+      <w:pPr>
+        <w:pStyle w:val="FirstParagraph"/>
+      </w:pPr>
+      <w:r>
+        <w:t xml:space="preserve">When using AI agents for mathematical derivation and statistical analysis:</w:t>
+      </w:r>
+    </w:p>
+    <w:p>
+      <w:pPr>
+        <w:pStyle w:val="Compact"/>
+        <w:numPr>
+          <w:ilvl w:val="0"/>
+          <w:numId w:val="1006"/>
+        </w:numPr>
+      </w:pPr>
+      <w:r>
+        <w:rPr>
+          <w:b/>
+          <w:bCs/>
+        </w:rPr>
+        <w:t xml:space="preserve">Require Code Execution for Verification</w:t>
+      </w:r>
+      <w:r>
+        <w:t xml:space="preserve">:</w:t>
+      </w:r>
+      <w:r>
+        <w:t xml:space="preserve"> </w:t>
+      </w:r>
+      <w:r>
+        <w:t xml:space="preserve">Always prompt agents to formulate algebraic steps in symbolic engines</w:t>
+      </w:r>
+      <w:r>
+        <w:t xml:space="preserve"> </w:t>
+      </w:r>
+      <w:r>
+        <w:t xml:space="preserve">(</w:t>
+      </w:r>
+      <w:hyperlink r:id="rId13">
+        <w:r>
+          <w:rPr>
+            <w:rStyle w:val="Hyperlink"/>
+          </w:rPr>
+          <w:t xml:space="preserve">SymPy</w:t>
+        </w:r>
+      </w:hyperlink>
+      <w:r>
+        <w:t xml:space="preserve">, Maxima) or verify numerical results through simulation in R or Python.</w:t>
+      </w:r>
+    </w:p>
+    <w:p>
+      <w:pPr>
+        <w:pStyle w:val="Compact"/>
+        <w:numPr>
+          <w:ilvl w:val="0"/>
+          <w:numId w:val="1006"/>
+        </w:numPr>
+      </w:pPr>
+      <w:r>
+        <w:rPr>
+          <w:b/>
+          <w:bCs/>
+        </w:rPr>
+        <w:t xml:space="preserve">Beware of Hallucinated Lemmas</w:t>
+      </w:r>
+      <w:r>
+        <w:t xml:space="preserve">:</w:t>
+      </w:r>
+      <w:r>
+        <w:t xml:space="preserve"> </w:t>
+      </w:r>
+      <w:r>
+        <w:t xml:space="preserve">Language models can assert non-existent mathematical theorems or cite</w:t>
+      </w:r>
+      <w:r>
+        <w:t xml:space="preserve"> </w:t>
+      </w:r>
+      <w:r>
+        <w:t xml:space="preserve">fabricated lemmas with high confidence.</w:t>
+      </w:r>
+      <w:r>
+        <w:t xml:space="preserve"> </w:t>
+      </w:r>
+      <w:r>
+        <w:t xml:space="preserve">Require agents to write out complete, self-contained proofs without appealing</w:t>
+      </w:r>
+      <w:r>
+        <w:t xml:space="preserve"> </w:t>
+      </w:r>
+      <w:r>
+        <w:t xml:space="preserve">to unverified named theorems.</w:t>
+      </w:r>
+    </w:p>
+    <w:p>
+      <w:pPr>
+        <w:pStyle w:val="Compact"/>
+        <w:numPr>
+          <w:ilvl w:val="0"/>
+          <w:numId w:val="1006"/>
+        </w:numPr>
+      </w:pPr>
+      <w:r>
+        <w:rPr>
+          <w:b/>
+          <w:bCs/>
+        </w:rPr>
+        <w:t xml:space="preserve">Use Monte Carlo Simulation for Statistical Validation</w:t>
+      </w:r>
+      <w:r>
+        <w:t xml:space="preserve">:</w:t>
+      </w:r>
+      <w:r>
+        <w:t xml:space="preserve"> </w:t>
+      </w:r>
+      <w:r>
+        <w:t xml:space="preserve">For complex estimators or unfamiliar statistical distributions, instruct</w:t>
+      </w:r>
+      <w:r>
+        <w:t xml:space="preserve"> </w:t>
+      </w:r>
+      <w:r>
+        <w:t xml:space="preserve">the agent to implement a Monte Carlo simulation verifying empirical bias,</w:t>
+      </w:r>
+      <w:r>
+        <w:t xml:space="preserve"> </w:t>
+      </w:r>
+      <w:r>
+        <w:t xml:space="preserve">variance, and asymptotic normality against theoretical claims.</w:t>
+      </w:r>
+    </w:p>
+    <w:p>
+      <w:pPr>
+        <w:pStyle w:val="Compact"/>
+        <w:numPr>
+          <w:ilvl w:val="0"/>
+          <w:numId w:val="1006"/>
+        </w:numPr>
+      </w:pPr>
+      <w:r>
+        <w:rPr>
+          <w:b/>
+          <w:bCs/>
+        </w:rPr>
+        <w:t xml:space="preserve">Formal Verification in Research</w:t>
+      </w:r>
+      <w:r>
+        <w:t xml:space="preserve">:</w:t>
+      </w:r>
+      <w:r>
+        <w:t xml:space="preserve"> </w:t>
+      </w:r>
+      <w:r>
+        <w:t xml:space="preserve">For foundational mathematics and critical proof pipelines, consider</w:t>
+      </w:r>
+      <w:r>
+        <w:t xml:space="preserve"> </w:t>
+      </w:r>
+      <w:r>
+        <w:t xml:space="preserve">formalizing results in interactive theorem provers such as</w:t>
+      </w:r>
+      <w:r>
+        <w:t xml:space="preserve"> </w:t>
+      </w:r>
+      <w:hyperlink r:id="rId15">
+        <w:r>
+          <w:rPr>
+            <w:rStyle w:val="Hyperlink"/>
+          </w:rPr>
+          <w:t xml:space="preserve">Lean 4</w:t>
+        </w:r>
+      </w:hyperlink>
+      <w:r>
+        <w:t xml:space="preserve">,</w:t>
+      </w:r>
+      <w:r>
+        <w:t xml:space="preserve"> </w:t>
+      </w:r>
+      <w:r>
+        <w:t xml:space="preserve">where proofs are mechanically verified by an axiomatic kernel.</w:t>
+      </w:r>
+    </w:p>
+    <w:bookmarkEnd w:id="23"/>
     <w:sectPr>
       <w:footnotePr>
         <w:numRestart w:val="eachSect"/>
@@ -1199,6 +1866,91 @@
       </w:rPr>
     </w:lvl>
   </w:abstractNum>
+  <w:abstractNum w:abstractNumId="99411">
+    <w:nsid w:val="00A99411"/>
+    <w:multiLevelType w:val="multilevel"/>
+    <w:lvl w:ilvl="0">
+      <w:start w:val="1"/>
+      <w:numFmt w:val="decimal"/>
+      <w:lvlText w:val="%1."/>
+      <w:lvlJc w:val="left"/>
+      <w:pPr>
+        <w:ind w:left="720" w:hanging="360"/>
+      </w:pPr>
+    </w:lvl>
+    <w:lvl w:ilvl="1">
+      <w:start w:val="1"/>
+      <w:numFmt w:val="decimal"/>
+      <w:lvlText w:val="%2."/>
+      <w:lvlJc w:val="left"/>
+      <w:pPr>
+        <w:ind w:left="1440" w:hanging="360"/>
+      </w:pPr>
+    </w:lvl>
+    <w:lvl w:ilvl="2">
+      <w:start w:val="1"/>
+      <w:numFmt w:val="decimal"/>
+      <w:lvlText w:val="%3."/>
+      <w:lvlJc w:val="left"/>
+      <w:pPr>
+        <w:ind w:left="2160" w:hanging="360"/>
+      </w:pPr>
+    </w:lvl>
+    <w:lvl w:ilvl="3">
+      <w:start w:val="1"/>
+      <w:numFmt w:val="decimal"/>
+      <w:lvlText w:val="%4."/>
+      <w:lvlJc w:val="left"/>
+      <w:pPr>
+        <w:ind w:left="2880" w:hanging="360"/>
+      </w:pPr>
+    </w:lvl>
+    <w:lvl w:ilvl="4">
+      <w:start w:val="1"/>
+      <w:numFmt w:val="decimal"/>
+      <w:lvlText w:val="%5."/>
+      <w:lvlJc w:val="left"/>
+      <w:pPr>
+        <w:ind w:left="3600" w:hanging="360"/>
+      </w:pPr>
+    </w:lvl>
+    <w:lvl w:ilvl="5">
+      <w:start w:val="1"/>
+      <w:numFmt w:val="decimal"/>
+      <w:lvlText w:val="%6."/>
+      <w:lvlJc w:val="left"/>
+      <w:pPr>
+        <w:ind w:left="4320" w:hanging="360"/>
+      </w:pPr>
+    </w:lvl>
+    <w:lvl w:ilvl="6">
+      <w:start w:val="1"/>
+      <w:numFmt w:val="decimal"/>
+      <w:lvlText w:val="%7."/>
+      <w:lvlJc w:val="left"/>
+      <w:pPr>
+        <w:ind w:left="5040" w:hanging="360"/>
+      </w:pPr>
+    </w:lvl>
+    <w:lvl w:ilvl="7">
+      <w:start w:val="1"/>
+      <w:numFmt w:val="decimal"/>
+      <w:lvlText w:val="%8."/>
+      <w:lvlJc w:val="left"/>
+      <w:pPr>
+        <w:ind w:left="5760" w:hanging="360"/>
+      </w:pPr>
+    </w:lvl>
+    <w:lvl w:ilvl="8">
+      <w:start w:val="1"/>
+      <w:numFmt w:val="decimal"/>
+      <w:lvlText w:val="%9."/>
+      <w:lvlJc w:val="left"/>
+      <w:pPr>
+        <w:ind w:left="6480" w:hanging="360"/>
+      </w:pPr>
+    </w:lvl>
+  </w:abstractNum>
   <w:num w:numId="1000">
     <w:abstractNumId w:val="990"/>
   </w:num>
@@ -1210,6 +1962,69 @@
   </w:num>
   <w:num w:numId="1003">
     <w:abstractNumId w:val="991"/>
+  </w:num>
+  <w:num w:numId="1004">
+    <w:abstractNumId w:val="991"/>
+  </w:num>
+  <w:num w:numId="1005">
+    <w:abstractNumId w:val="99411"/>
+    <w:lvlOverride w:ilvl="0">
+      <w:startOverride w:val="1"/>
+    </w:lvlOverride>
+    <w:lvlOverride w:ilvl="1">
+      <w:startOverride w:val="1"/>
+    </w:lvlOverride>
+    <w:lvlOverride w:ilvl="2">
+      <w:startOverride w:val="1"/>
+    </w:lvlOverride>
+    <w:lvlOverride w:ilvl="3">
+      <w:startOverride w:val="1"/>
+    </w:lvlOverride>
+    <w:lvlOverride w:ilvl="4">
+      <w:startOverride w:val="1"/>
+    </w:lvlOverride>
+    <w:lvlOverride w:ilvl="5">
+      <w:startOverride w:val="1"/>
+    </w:lvlOverride>
+    <w:lvlOverride w:ilvl="6">
+      <w:startOverride w:val="1"/>
+    </w:lvlOverride>
+    <w:lvlOverride w:ilvl="7">
+      <w:startOverride w:val="1"/>
+    </w:lvlOverride>
+    <w:lvlOverride w:ilvl="8">
+      <w:startOverride w:val="1"/>
+    </w:lvlOverride>
+  </w:num>
+  <w:num w:numId="1006">
+    <w:abstractNumId w:val="99411"/>
+    <w:lvlOverride w:ilvl="0">
+      <w:startOverride w:val="1"/>
+    </w:lvlOverride>
+    <w:lvlOverride w:ilvl="1">
+      <w:startOverride w:val="1"/>
+    </w:lvlOverride>
+    <w:lvlOverride w:ilvl="2">
+      <w:startOverride w:val="1"/>
+    </w:lvlOverride>
+    <w:lvlOverride w:ilvl="3">
+      <w:startOverride w:val="1"/>
+    </w:lvlOverride>
+    <w:lvlOverride w:ilvl="4">
+      <w:startOverride w:val="1"/>
+    </w:lvlOverride>
+    <w:lvlOverride w:ilvl="5">
+      <w:startOverride w:val="1"/>
+    </w:lvlOverride>
+    <w:lvlOverride w:ilvl="6">
+      <w:startOverride w:val="1"/>
+    </w:lvlOverride>
+    <w:lvlOverride w:ilvl="7">
+      <w:startOverride w:val="1"/>
+    </w:lvlOverride>
+    <w:lvlOverride w:ilvl="8">
+      <w:startOverride w:val="1"/>
+    </w:lvlOverride>
   </w:num>
 </w:numbering>
 </file>

</xml_diff>